<commit_message>
style: Apply standard university header template and embed plot images in all DOCX reports
</commit_message>
<xml_diff>
--- a/Ass2_2/60_Assignment-2.2_DL.docx
+++ b/Ass2_2/60_Assignment-2.2_DL.docx
@@ -8,21 +8,142 @@
       </w:pPr>
       <w:r>
         <w:rPr>
+          <w:rFonts w:ascii="Arial" w:hAnsi="Arial"/>
+          <w:i/>
+          <w:sz w:val="24"/>
+        </w:rPr>
+        <w:t>BRACT's</w:t>
+      </w:r>
+    </w:p>
+    <w:p>
+      <w:pPr>
+        <w:jc w:val="center"/>
+      </w:pPr>
+      <w:r>
+        <w:rPr>
+          <w:rFonts w:ascii="Arial" w:hAnsi="Arial"/>
           <w:b/>
-          <w:sz w:val="32"/>
+          <w:sz w:val="28"/>
+          <w:u w:val="single"/>
         </w:rPr>
         <w:t>Vishwakarma Institute of Technology, Pune</w:t>
-        <w:br/>
+      </w:r>
+    </w:p>
+    <w:p>
+      <w:pPr>
+        <w:jc w:val="center"/>
+      </w:pPr>
+      <w:r>
+        <w:rPr>
+          <w:rFonts w:ascii="Arial" w:hAnsi="Arial"/>
+          <w:b/>
+          <w:sz w:val="24"/>
+          <w:u w:val="single"/>
+        </w:rPr>
+        <w:t>Practical Implementation Sheet</w:t>
+      </w:r>
+    </w:p>
+    <w:p/>
+    <w:p>
+      <w:pPr>
+        <w:jc w:val="center"/>
+      </w:pPr>
+      <w:r>
+        <w:rPr>
+          <w:u w:val="single"/>
+        </w:rPr>
+        <w:t xml:space="preserve">Department: </w:t>
+      </w:r>
+      <w:r>
+        <w:t xml:space="preserve">CSE-AI        </w:t>
       </w:r>
       <w:r>
         <w:rPr>
+          <w:u w:val="single"/>
+        </w:rPr>
+        <w:t>Semester: 5</w:t>
+      </w:r>
+      <w:r>
+        <w:t xml:space="preserve">        </w:t>
+      </w:r>
+      <w:r>
+        <w:rPr>
+          <w:u w:val="single"/>
+        </w:rPr>
+        <w:t>Academic Year: 2026-27</w:t>
+      </w:r>
+    </w:p>
+    <w:p>
+      <w:pPr>
+        <w:jc w:val="center"/>
+      </w:pPr>
+      <w:r>
+        <w:rPr>
+          <w:u w:val="single"/>
+        </w:rPr>
+        <w:t xml:space="preserve">Division: </w:t>
+      </w:r>
+      <w:r>
+        <w:t xml:space="preserve">E        </w:t>
+      </w:r>
+      <w:r>
+        <w:rPr>
+          <w:u w:val="single"/>
+        </w:rPr>
+        <w:t>Batch: 3</w:t>
+      </w:r>
+      <w:r>
+        <w:t xml:space="preserve">        </w:t>
+      </w:r>
+      <w:r>
+        <w:rPr>
+          <w:u w:val="single"/>
+        </w:rPr>
+        <w:t>Practical No: 2.2</w:t>
+      </w:r>
+    </w:p>
+    <w:p>
+      <w:pPr>
+        <w:jc w:val="center"/>
+      </w:pPr>
+      <w:r>
+        <w:rPr>
+          <w:u w:val="single"/>
+        </w:rPr>
+        <w:t xml:space="preserve">Roll no: </w:t>
+      </w:r>
+      <w:r>
+        <w:t xml:space="preserve">60        </w:t>
+      </w:r>
+      <w:r>
+        <w:rPr>
+          <w:u w:val="single"/>
+        </w:rPr>
+        <w:t>PRN No: 12414029</w:t>
+      </w:r>
+      <w:r>
+        <w:t xml:space="preserve">        </w:t>
+      </w:r>
+      <w:r>
+        <w:rPr>
+          <w:u w:val="single"/>
+        </w:rPr>
+        <w:t>Name of Student: Shaikh Hunain</w:t>
+      </w:r>
+    </w:p>
+    <w:p/>
+    <w:p>
+      <w:pPr>
+        <w:jc w:val="center"/>
+      </w:pPr>
+      <w:r>
+        <w:rPr>
+          <w:rFonts w:ascii="Arial" w:hAnsi="Arial"/>
           <w:b/>
-          <w:sz w:val="26"/>
+          <w:sz w:val="24"/>
+          <w:u w:val="single"/>
         </w:rPr>
-        <w:t>Department of Computer Engineering (Artificial Intelligence)</w:t>
-        <w:br/>
-        <w:t>CI3201: Deep Learning - Lab Assignment 2.2</w:t>
-        <w:br/>
+        <w:t>Subject Name : Deep Learning</w:t>
       </w:r>
     </w:p>
     <w:p>
@@ -53,11 +174,11 @@
     </w:p>
     <w:p>
       <w:r>
-        <w:t>1. Transition from Single-Layer Perceptron (SLP) to Multilayer Perceptron (MLP).</w:t>
+        <w:t>1. Transition from SLP to MLP.</w:t>
         <w:br/>
-        <w:t>2. Understand the role of hidden layers and non-linear activation functions (ReLU).</w:t>
+        <w:t>2. Utilize hidden layers and ReLU.</w:t>
         <w:br/>
-        <w:t>3. Evaluate the multi-class classification performance using a Confusion Matrix.</w:t>
+        <w:t>3. Evaluate multi-class classification.</w:t>
       </w:r>
     </w:p>
     <w:p>
@@ -70,25 +191,15 @@
     </w:p>
     <w:p>
       <w:r>
-        <w:t>1. Load the Scikit-learn Wine dataset (13 features, 3 classes).</w:t>
+        <w:t>1. Load Scikit-learn Wine dataset.</w:t>
         <w:br/>
-        <w:t>2. Preprocess by splitting (80/20) and applying Standard Scaling (mean=0, variance=1).</w:t>
+        <w:t>2. Standardize features.</w:t>
         <w:br/>
-        <w:t>3. Define a PyTorch MLP architecture:</w:t>
+        <w:t>3. Define PyTorch MLP (13 -&gt; 64 -&gt; 32 -&gt; 3).</w:t>
         <w:br/>
-        <w:t xml:space="preserve">   - Input Layer (13 neurons)</w:t>
+        <w:t>4. Train with CrossEntropyLoss and Adam.</w:t>
         <w:br/>
-        <w:t xml:space="preserve">   - Hidden Layer 1 (64 neurons) + ReLU</w:t>
-        <w:br/>
-        <w:t xml:space="preserve">   - Hidden Layer 2 (32 neurons) + ReLU</w:t>
-        <w:br/>
-        <w:t xml:space="preserve">   - Output Layer (3 neurons for 3 classes)</w:t>
-        <w:br/>
-        <w:t>4. Train using Adam Optimizer (lr=0.01) and Cross-Entropy Loss for 100 epochs.</w:t>
-        <w:br/>
-        <w:t>5. Plot training loss vs validation accuracy.</w:t>
-        <w:br/>
-        <w:t>6. Construct a Confusion Matrix to visually confirm True Positives vs False Positives across the 3 cultivars.</w:t>
+        <w:t>5. Plot confusion matrix.</w:t>
       </w:r>
     </w:p>
     <w:p>
@@ -96,16 +207,114 @@
         <w:pStyle w:val="Heading2"/>
       </w:pPr>
       <w:r>
-        <w:t>4. Evaluation &amp; Conclusion</w:t>
+        <w:t>4. Conclusion</w:t>
       </w:r>
     </w:p>
     <w:p>
       <w:r>
-        <w:t>1. The Multilayer Perceptron handles non-linearly separable data much better than the SLP.</w:t>
-        <w:br/>
-        <w:t>2. The model achieved nearly perfect accuracy on the Wine dataset.</w:t>
-        <w:br/>
-        <w:t>3. The Confusion Matrix explicitly visualizes any misclassifications between Cultivar 0, 1, and 2, confirming the model's reliability.</w:t>
+        <w:t>The MLP handles complex multi-class data effectively, achieving near-perfect accuracy on the Wine dataset by learning non-linear relationships.</w:t>
+      </w:r>
+    </w:p>
+    <w:p>
+      <w:pPr>
+        <w:pStyle w:val="Heading2"/>
+      </w:pPr>
+      <w:r>
+        <w:t>5. Plots &amp; Visualizations</w:t>
+      </w:r>
+    </w:p>
+    <w:p>
+      <w:pPr>
+        <w:jc w:val="center"/>
+      </w:pPr>
+      <w:r>
+        <w:drawing>
+          <wp:inline xmlns:a="http://schemas.openxmlformats.org/drawingml/2006/main" xmlns:pic="http://schemas.openxmlformats.org/drawingml/2006/picture">
+            <wp:extent cx="4572000" cy="3657600"/>
+            <wp:docPr id="1" name="Picture 1"/>
+            <wp:cNvGraphicFramePr>
+              <a:graphicFrameLocks noChangeAspect="1"/>
+            </wp:cNvGraphicFramePr>
+            <a:graphic>
+              <a:graphicData uri="http://schemas.openxmlformats.org/drawingml/2006/picture">
+                <pic:pic>
+                  <pic:nvPicPr>
+                    <pic:cNvPr id="0" name="mlp_confusion_matrix.png"/>
+                    <pic:cNvPicPr/>
+                  </pic:nvPicPr>
+                  <pic:blipFill>
+                    <a:blip r:embed="rId9"/>
+                    <a:stretch>
+                      <a:fillRect/>
+                    </a:stretch>
+                  </pic:blipFill>
+                  <pic:spPr>
+                    <a:xfrm>
+                      <a:off x="0" y="0"/>
+                      <a:ext cx="4572000" cy="3657600"/>
+                    </a:xfrm>
+                    <a:prstGeom prst="rect"/>
+                  </pic:spPr>
+                </pic:pic>
+              </a:graphicData>
+            </a:graphic>
+          </wp:inline>
+        </w:drawing>
+      </w:r>
+    </w:p>
+    <w:p>
+      <w:pPr>
+        <w:jc w:val="center"/>
+      </w:pPr>
+      <w:r>
+        <w:t>mlp_confusion_matrix.png</w:t>
+      </w:r>
+    </w:p>
+    <w:p>
+      <w:pPr>
+        <w:jc w:val="center"/>
+      </w:pPr>
+      <w:r>
+        <w:drawing>
+          <wp:inline xmlns:a="http://schemas.openxmlformats.org/drawingml/2006/main" xmlns:pic="http://schemas.openxmlformats.org/drawingml/2006/picture">
+            <wp:extent cx="4572000" cy="1828800"/>
+            <wp:docPr id="2" name="Picture 2"/>
+            <wp:cNvGraphicFramePr>
+              <a:graphicFrameLocks noChangeAspect="1"/>
+            </wp:cNvGraphicFramePr>
+            <a:graphic>
+              <a:graphicData uri="http://schemas.openxmlformats.org/drawingml/2006/picture">
+                <pic:pic>
+                  <pic:nvPicPr>
+                    <pic:cNvPr id="0" name="mlp_training_curve.png"/>
+                    <pic:cNvPicPr/>
+                  </pic:nvPicPr>
+                  <pic:blipFill>
+                    <a:blip r:embed="rId10"/>
+                    <a:stretch>
+                      <a:fillRect/>
+                    </a:stretch>
+                  </pic:blipFill>
+                  <pic:spPr>
+                    <a:xfrm>
+                      <a:off x="0" y="0"/>
+                      <a:ext cx="4572000" cy="1828800"/>
+                    </a:xfrm>
+                    <a:prstGeom prst="rect"/>
+                  </pic:spPr>
+                </pic:pic>
+              </a:graphicData>
+            </a:graphic>
+          </wp:inline>
+        </w:drawing>
+      </w:r>
+    </w:p>
+    <w:p>
+      <w:pPr>
+        <w:jc w:val="center"/>
+      </w:pPr>
+      <w:r>
+        <w:t>mlp_training_curve.png</w:t>
       </w:r>
     </w:p>
     <w:sectPr>
@@ -481,6 +690,10 @@
     <w:name w:val="Normal"/>
     <w:qFormat/>
     <w:rsid w:val="00FC693F"/>
+    <w:rPr>
+      <w:rFonts w:ascii="Arial" w:hAnsi="Arial"/>
+      <w:sz w:val="22"/>
+    </w:rPr>
   </w:style>
   <w:style w:type="paragraph" w:styleId="Header">
     <w:name w:val="header"/>

</xml_diff>